<commit_message>
feat(brand): complete corporate communications repositioning per Miss Sarah's 14 requirements
</commit_message>
<xml_diff>
--- a/static/downloads/Sarah-Ogembo-MC-Resume.docx
+++ b/static/downloads/Sarah-Ogembo-MC-Resume.docx
@@ -11833,34 +11833,7 @@
         <w:ind w:left="113" w:right="4661"/>
       </w:pPr>
       <w:r>
-        <w:t>Kenya</w:t>
-      </w:r>
-      <w:r>
-        <w:rPr>
-          <w:spacing w:val="-10"/>
-        </w:rPr>
-        <w:t xml:space="preserve"> </w:t>
-      </w:r>
-      <w:r>
-        <w:t>National</w:t>
-      </w:r>
-      <w:r>
-        <w:rPr>
-          <w:spacing w:val="-13"/>
-        </w:rPr>
-        <w:t xml:space="preserve"> </w:t>
-      </w:r>
-      <w:r>
-        <w:t>Library</w:t>
-      </w:r>
-      <w:r>
-        <w:rPr>
-          <w:spacing w:val="-11"/>
-        </w:rPr>
-        <w:t xml:space="preserve"> </w:t>
-      </w:r>
-      <w:r>
-        <w:t>Service Phone: +254 724 506 581</w:t>
+        <w:t>Senior Marketing Officer, Kenya National Library Service | Phone: +254 724 506 581</w:t>
       </w:r>
     </w:p>
     <w:p>

</xml_diff>